<commit_message>
Clean final deliverable wording
</commit_message>
<xml_diff>
--- a/ADMIN_MANUAL.docx
+++ b/ADMIN_MANUAL.docx
@@ -2344,7 +2344,7 @@
                 <w:color w:val="000000"/>
                 <w:sz w:val="16"/>
               </w:rPr>
-              <w:t>Prototype simulation</w:t>
+              <w:t>Prototype estimate</w:t>
             </w:r>
           </w:p>
         </w:tc>
@@ -2372,7 +2372,7 @@
                 <w:color w:val="000000"/>
                 <w:sz w:val="16"/>
               </w:rPr>
-              <w:t>Staff toggle simulates transport staff publishing a disruption so the logic proof and alert workflow can be shown.</w:t>
+              <w:t>Staff toggle represents transport staff publishing a disruption so the logic proof and alert workflow can be shown.</w:t>
             </w:r>
           </w:p>
         </w:tc>

</xml_diff>